<commit_message>
Entregar experiencia Vertia y handoff de continuidad a Claude y Gemini
Incorpora la explicación previa, flujos animados, modelos supuestos,
perfilamiento comercial y lectura real de PDF e imágenes con acceso privado.

Registra las pruebas y el despliegue, preserva los aportes de Claude Code y
Gemini en Antigravity y deja explícito el defecto abierto al cambiar versiones.
La continuación debe resolver y verificar ese caso antes de cerrar la entrega.
</commit_message>
<xml_diff>
--- a/deliverables/contratos.docx
+++ b/deliverables/contratos.docx
@@ -203,7 +203,7 @@
         <w:pStyle w:val="Heading2"/>
       </w:pPr>
       <w:r>
-        <w:t xml:space="preserve">Alcance incluido con límites propuestos</w:t>
+        <w:t xml:space="preserve">Alcance incluido, con límites propuestos</w:t>
       </w:r>
     </w:p>
     <w:bookmarkStart w:id="21" w:name="repositorio-y-ficha-del-contrato"/>
@@ -230,7 +230,7 @@
         <w:pStyle w:val="Heading3"/>
       </w:pPr>
       <w:r>
-        <w:t xml:space="preserve">Solicitudes clasificación y versiones</w:t>
+        <w:t xml:space="preserve">Solicitudes, clasificación y versiones</w:t>
       </w:r>
     </w:p>
     <w:p>
@@ -266,7 +266,7 @@
         <w:pStyle w:val="Heading3"/>
       </w:pPr>
       <w:r>
-        <w:t xml:space="preserve">OCR búsqueda y asistencia con Claude</w:t>
+        <w:t xml:space="preserve">OCR, búsqueda y asistencia con Claude</w:t>
       </w:r>
     </w:p>
     <w:p>
@@ -284,7 +284,7 @@
         <w:pStyle w:val="Heading3"/>
       </w:pPr>
       <w:r>
-        <w:t xml:space="preserve">Alertas revisión y aprobación</w:t>
+        <w:t xml:space="preserve">Alertas, revisión y aprobación</w:t>
       </w:r>
     </w:p>
     <w:p>
@@ -408,7 +408,7 @@
         <w:pStyle w:val="Heading3"/>
       </w:pPr>
       <w:r>
-        <w:t xml:space="preserve">Fase 1 MVP documental</w:t>
+        <w:t xml:space="preserve">Fase 1 — MVP documental</w:t>
       </w:r>
     </w:p>
     <w:p>
@@ -426,7 +426,7 @@
         <w:pStyle w:val="Heading3"/>
       </w:pPr>
       <w:r>
-        <w:t xml:space="preserve">Fase 2 Flujo contractual y firma</w:t>
+        <w:t xml:space="preserve">Fase 2 — Flujo contractual y firma</w:t>
       </w:r>
     </w:p>
     <w:p>
@@ -1623,7 +1623,7 @@
         <w:pStyle w:val="Heading2"/>
       </w:pPr>
       <w:r>
-        <w:t xml:space="preserve">Soporte propuesto contratado por separado</w:t>
+        <w:t xml:space="preserve">Soporte propuesto (contratado por separado)</w:t>
       </w:r>
     </w:p>
     <w:p>
@@ -1659,7 +1659,7 @@
         <w:pStyle w:val="Heading2"/>
       </w:pPr>
       <w:r>
-        <w:t xml:space="preserve">Propiedad licencias y cambios de alcance</w:t>
+        <w:t xml:space="preserve">Propiedad, licencias y cambios de alcance</w:t>
       </w:r>
     </w:p>
     <w:p>

</xml_diff>